<commit_message>
fix(dir410346): corrige paginação Sbriccoli 2011 e datação do Malleus nos materiais
Paginação do ensaio "Justiça criminal" (Discursos Sediciosos, n. 17/18)
conferida no exemplar em 2026-08-06: o ensaio ocupa p. 459-486, não
459-504 (12 ocorrências corrigidas) nem 464-476 (entrada do artigo v2).

Datação do Malleus Maleficarum alinhada à dupla data 1486/1487 (edição
de Speyer 1486 / aprovação de Colônia 1487) nas datações explícitas de
handouts, slides, flyer, papers e drafts; listas retóricas de anos e o
recorte de periodização do draft "Duvidam, punem" preservados. "Impresso
em Speyer em 1487" corrigido para 1486 (docx v2 e draft).

Derivados regenerados a partir das fontes corrigidas: short-paper
(pandoc/xelatex, 11 p.), artigo da wiki (pandoc/xelatex, 6 p.), v2-ABNT
(LibreOffice a partir do docx entregue corrigido, 16 p.). Flyer já
estava limpo. Verificação: rastro em
correcao-final-dir410346/HISTORICO-REVISOES.md (rodada 4).
</commit_message>
<xml_diff>
--- a/vault/obsidian-dir410346/aulas/assets-apresentacao-malleus/entrega-2026-06-30/paper-malleus-cajada-short-paper.docx
+++ b/vault/obsidian-dir410346/aulas/assets-apresentacao-malleus/entrega-2026-06-30/paper-malleus-cajada-short-paper.docx
@@ -139,7 +139,7 @@
         <w:t xml:space="preserve"> </w:t>
       </w:r>
       <w:r>
-        <w:t xml:space="preserve">(1487) e de sua deformação no espaço colonial luso-atlântico, tomando como estudo de caso o processo inquisitorial de Maria Gonçalves Cajada, conhecida como</w:t>
+        <w:t xml:space="preserve">(1486/1487) e de sua deformação no espaço colonial luso-atlântico, tomando como estudo de caso o processo inquisitorial de Maria Gonçalves Cajada, conhecida como</w:t>
       </w:r>
       <w:r>
         <w:t xml:space="preserve"> </w:t>
@@ -253,7 +253,7 @@
         <w:t xml:space="preserve">Malleus Maleficarum</w:t>
       </w:r>
       <w:r>
-        <w:t xml:space="preserve">, publicado em 1487 e associado sobretudo a Heinrich Institoris, costuma aparecer como símbolo maior da perseguição às bruxas. Mas sua relevância para a história do direito penal não está somente em seu conteúdo misógino ou demonológico. O ponto decisivo é que o</w:t>
+        <w:t xml:space="preserve">, publicado em 1486/1487 e associado sobretudo a Heinrich Institoris, costuma aparecer como símbolo maior da perseguição às bruxas. Mas sua relevância para a história do direito penal não está somente em seu conteúdo misógino ou demonológico. O ponto decisivo é que o</w:t>
       </w:r>
       <w:r>
         <w:t xml:space="preserve"> </w:t>
@@ -1183,7 +1183,7 @@
         <w:t xml:space="preserve">Discursos Sediciosos</w:t>
       </w:r>
       <w:r>
-        <w:t xml:space="preserve">, Rio de Janeiro, n. 17/18, p. 459-504, 2011.</w:t>
+        <w:t xml:space="preserve">, Rio de Janeiro, n. 17/18, p. 459-486, 2011.</w:t>
       </w:r>
     </w:p>
     <w:p>

</xml_diff>